<commit_message>
Jai ajouté deux chapitres
</commit_message>
<xml_diff>
--- a/redaction/chapitre13/paragraphes.docx
+++ b/redaction/chapitre13/paragraphes.docx
@@ -2,13 +2,13 @@
 <file path=word/document.xml><?xml version="1.0" encoding="utf-8"?>
 <w:document xmlns:w="http://schemas.openxmlformats.org/wordprocessingml/2006/main" xmlns:m="http://schemas.openxmlformats.org/officeDocument/2006/math" xmlns:r="http://schemas.openxmlformats.org/officeDocument/2006/relationships" xmlns:o="urn:schemas-microsoft-com:office:office" xmlns:v="urn:schemas-microsoft-com:vml" xmlns:w10="urn:schemas-microsoft-com:office:word" xmlns:a="http://schemas.openxmlformats.org/drawingml/2006/main" xmlns:pic="http://schemas.openxmlformats.org/drawingml/2006/picture" xmlns:wp="http://schemas.openxmlformats.org/drawingml/2006/wordprocessingDrawing">
   <w:body>
-    <w:bookmarkStart w:id="24" w:name="Xde4039b105dc491586e7d0982c24e6401a93c05"/>
+    <w:bookmarkStart w:id="25" w:name="Xb9164422b3e4a46b434f417eeabe7de5d122d71"/>
     <w:p>
       <w:pPr>
         <w:pStyle w:val="Heading1"/>
       </w:pPr>
       <w:r>
-        <w:t xml:space="preserve">Chapitre 13 : Environnement virtuel adapté à chaque application</w:t>
+        <w:t xml:space="preserve">Chapitre 11 : Script python en ligne de commande et passage d’arguments</w:t>
       </w:r>
     </w:p>
     <w:p>
@@ -16,7 +16,7 @@
         <w:pStyle w:val="FirstParagraph"/>
       </w:pPr>
       <w:r>
-        <w:t xml:space="preserve">La création d’environnements virtuels permet d’isoler les dépendances de chaque application Python pour éviter les conflits entre les bibliothèques installées sur le système. Maîtriser ces outils est indispensable pour garantir la stabilité et la reproductibilité de vos projets.</w:t>
+        <w:t xml:space="preserve">La création de scripts en ligne de commande et le passage d’arguments permettent d’automatiser des tâches et d’interagir directement avec vos programmes Python depuis le terminal. Maîtriser ces outils est indispensable pour industrialiser vos développements.</w:t>
       </w:r>
       <w:r>
         <w:t xml:space="preserve"> </w:t>
@@ -33,7 +33,7 @@
         </w:numPr>
       </w:pPr>
       <w:r>
-        <w:t xml:space="preserve">Création d’un contexte Python isolé avec</w:t>
+        <w:t xml:space="preserve">Scripts et</w:t>
       </w:r>
       <w:r>
         <w:t xml:space="preserve"> </w:t>
@@ -42,7 +42,7 @@
         <w:rPr>
           <w:rStyle w:val="VerbatimChar"/>
         </w:rPr>
-        <w:t xml:space="preserve">venv</w:t>
+        <w:t xml:space="preserve">__main__</w:t>
       </w:r>
     </w:p>
     <w:p>
@@ -53,25 +53,27 @@
         </w:numPr>
       </w:pPr>
       <w:r>
-        <w:t xml:space="preserve">Utilisation des scripts d’activation et de désactivation (</w:t>
+        <w:t xml:space="preserve">Scripts et passage d’arguments</w:t>
+      </w:r>
+    </w:p>
+    <w:p>
+      <w:pPr>
+        <w:numPr>
+          <w:ilvl w:val="0"/>
+          <w:numId w:val="1001"/>
+        </w:numPr>
+      </w:pPr>
+      <w:r>
+        <w:t xml:space="preserve">Gestion de package avec</w:t>
+      </w:r>
+      <w:r>
+        <w:t xml:space="preserve"> </w:t>
       </w:r>
       <w:r>
         <w:rPr>
           <w:rStyle w:val="VerbatimChar"/>
         </w:rPr>
-        <w:t xml:space="preserve">activate</w:t>
-      </w:r>
-      <w:r>
-        <w:t xml:space="preserve">/</w:t>
-      </w:r>
-      <w:r>
-        <w:rPr>
-          <w:rStyle w:val="VerbatimChar"/>
-        </w:rPr>
-        <w:t xml:space="preserve">deactivate</w:t>
-      </w:r>
-      <w:r>
-        <w:t xml:space="preserve">)</w:t>
+        <w:t xml:space="preserve">pip</w:t>
       </w:r>
     </w:p>
     <w:p>
@@ -81,13 +83,23 @@
         </w:pict>
       </w:r>
     </w:p>
-    <w:bookmarkStart w:id="20" w:name="X2edcb2a42c16584fc9b21fcb941ebb4e03686f0"/>
+    <w:bookmarkStart w:id="20" w:name="scripts-et-main"/>
     <w:p>
       <w:pPr>
         <w:pStyle w:val="Heading2"/>
       </w:pPr>
       <w:r>
-        <w:t xml:space="preserve">Création d’un context python isolé avec venv</w:t>
+        <w:t xml:space="preserve">Scripts et</w:t>
+      </w:r>
+      <w:r>
+        <w:t xml:space="preserve"> </w:t>
+      </w:r>
+      <w:r>
+        <w:rPr>
+          <w:bCs/>
+          <w:b/>
+        </w:rPr>
+        <w:t xml:space="preserve">main</w:t>
       </w:r>
     </w:p>
     <w:p>
@@ -95,7 +107,7 @@
         <w:pStyle w:val="FirstParagraph"/>
       </w:pPr>
       <w:r>
-        <w:t xml:space="preserve">Le module</w:t>
+        <w:t xml:space="preserve">La structure</w:t>
       </w:r>
       <w:r>
         <w:t xml:space="preserve"> </w:t>
@@ -104,13 +116,13 @@
         <w:rPr>
           <w:rStyle w:val="VerbatimChar"/>
         </w:rPr>
-        <w:t xml:space="preserve">venv</w:t>
-      </w:r>
-      <w:r>
-        <w:t xml:space="preserve"> </w:t>
-      </w:r>
-      <w:r>
-        <w:t xml:space="preserve">permet de générer un répertoire de travail contenant une copie autonome de l’interpréteur Python et de sa bibliothèque standard. Cela isole complètement l’environnement des paquets globaux de la machine.</w:t>
+        <w:t xml:space="preserve">if __name__ == "__main__":</w:t>
+      </w:r>
+      <w:r>
+        <w:t xml:space="preserve"> </w:t>
+      </w:r>
+      <w:r>
+        <w:t xml:space="preserve">permet d’identifier si un fichier Python est exécuté directement comme un script principal ou importé comme un module dans un autre programme.</w:t>
       </w:r>
     </w:p>
     <w:p>
@@ -121,34 +133,118 @@
         <w:rPr>
           <w:rStyle w:val="CommentTok"/>
         </w:rPr>
-        <w:t xml:space="preserve"># Création d'un environnement virtuel nommé .venv dans le répertoire du projet</w:t>
-      </w:r>
-      <w:r>
-        <w:br/>
-      </w:r>
-      <w:r>
-        <w:rPr>
-          <w:rStyle w:val="ExtensionTok"/>
-        </w:rPr>
-        <w:t xml:space="preserve">python</w:t>
-      </w:r>
-      <w:r>
-        <w:rPr>
-          <w:rStyle w:val="NormalTok"/>
-        </w:rPr>
-        <w:t xml:space="preserve"> </w:t>
-      </w:r>
-      <w:r>
-        <w:rPr>
-          <w:rStyle w:val="AttributeTok"/>
-        </w:rPr>
-        <w:t xml:space="preserve">-m</w:t>
-      </w:r>
-      <w:r>
-        <w:rPr>
-          <w:rStyle w:val="NormalTok"/>
-        </w:rPr>
-        <w:t xml:space="preserve"> venv .venv</w:t>
+        <w:t xml:space="preserve"># Vérification du point d'entrée principal du script</w:t>
+      </w:r>
+      <w:r>
+        <w:br/>
+      </w:r>
+      <w:r>
+        <w:rPr>
+          <w:rStyle w:val="KeywordTok"/>
+        </w:rPr>
+        <w:t xml:space="preserve">def</w:t>
+      </w:r>
+      <w:r>
+        <w:rPr>
+          <w:rStyle w:val="NormalTok"/>
+        </w:rPr>
+        <w:t xml:space="preserve"> executer_tache():</w:t>
+      </w:r>
+      <w:r>
+        <w:br/>
+      </w:r>
+      <w:r>
+        <w:rPr>
+          <w:rStyle w:val="NormalTok"/>
+        </w:rPr>
+        <w:t xml:space="preserve">    </w:t>
+      </w:r>
+      <w:r>
+        <w:rPr>
+          <w:rStyle w:val="BuiltInTok"/>
+        </w:rPr>
+        <w:t xml:space="preserve">print</w:t>
+      </w:r>
+      <w:r>
+        <w:rPr>
+          <w:rStyle w:val="NormalTok"/>
+        </w:rPr>
+        <w:t xml:space="preserve">(</w:t>
+      </w:r>
+      <w:r>
+        <w:rPr>
+          <w:rStyle w:val="StringTok"/>
+        </w:rPr>
+        <w:t xml:space="preserve">"Exécution du traitement principal..."</w:t>
+      </w:r>
+      <w:r>
+        <w:rPr>
+          <w:rStyle w:val="NormalTok"/>
+        </w:rPr>
+        <w:t xml:space="preserve">)</w:t>
+      </w:r>
+      <w:r>
+        <w:br/>
+      </w:r>
+      <w:r>
+        <w:br/>
+      </w:r>
+      <w:r>
+        <w:rPr>
+          <w:rStyle w:val="ControlFlowTok"/>
+        </w:rPr>
+        <w:t xml:space="preserve">if</w:t>
+      </w:r>
+      <w:r>
+        <w:rPr>
+          <w:rStyle w:val="NormalTok"/>
+        </w:rPr>
+        <w:t xml:space="preserve"> </w:t>
+      </w:r>
+      <w:r>
+        <w:rPr>
+          <w:rStyle w:val="VariableTok"/>
+        </w:rPr>
+        <w:t xml:space="preserve">__name__</w:t>
+      </w:r>
+      <w:r>
+        <w:rPr>
+          <w:rStyle w:val="NormalTok"/>
+        </w:rPr>
+        <w:t xml:space="preserve"> </w:t>
+      </w:r>
+      <w:r>
+        <w:rPr>
+          <w:rStyle w:val="OperatorTok"/>
+        </w:rPr>
+        <w:t xml:space="preserve">==</w:t>
+      </w:r>
+      <w:r>
+        <w:rPr>
+          <w:rStyle w:val="NormalTok"/>
+        </w:rPr>
+        <w:t xml:space="preserve"> </w:t>
+      </w:r>
+      <w:r>
+        <w:rPr>
+          <w:rStyle w:val="StringTok"/>
+        </w:rPr>
+        <w:t xml:space="preserve">"__main__"</w:t>
+      </w:r>
+      <w:r>
+        <w:rPr>
+          <w:rStyle w:val="NormalTok"/>
+        </w:rPr>
+        <w:t xml:space="preserve">:</w:t>
+      </w:r>
+      <w:r>
+        <w:br/>
+      </w:r>
+      <w:r>
+        <w:rPr>
+          <w:rStyle w:val="NormalTok"/>
+        </w:rPr>
+        <w:t xml:space="preserve">    executer_tache()</w:t>
       </w:r>
     </w:p>
     <w:p>
@@ -156,22 +252,7 @@
         <w:pStyle w:val="BlockText"/>
       </w:pPr>
       <w:r>
-        <w:t xml:space="preserve">💡 Nommez généralement votre environnement virtuel</w:t>
-      </w:r>
-      <w:r>
-        <w:t xml:space="preserve"> </w:t>
-      </w:r>
-      <w:r>
-        <w:rPr>
-          <w:rStyle w:val="VerbatimChar"/>
-        </w:rPr>
-        <w:t xml:space="preserve">.venv</w:t>
-      </w:r>
-      <w:r>
-        <w:t xml:space="preserve"> </w:t>
-      </w:r>
-      <w:r>
-        <w:t xml:space="preserve">pour qu’il soit facilement identifiable et ignoré par les outils de gestion de versions comme Git.</w:t>
+        <w:t xml:space="preserve">💡 Placez toujours le code d’exécution principale de vos scripts sous cette condition pour permettre la réutilisation propre de vos fonctions par d’autres modules.</w:t>
       </w:r>
     </w:p>
     <w:p>
@@ -182,13 +263,13 @@
       </w:r>
     </w:p>
     <w:bookmarkEnd w:id="20"/>
-    <w:bookmarkStart w:id="21" w:name="script-activatedeactivate"/>
+    <w:bookmarkStart w:id="21" w:name="scripts-et-passage-darguments"/>
     <w:p>
       <w:pPr>
         <w:pStyle w:val="Heading2"/>
       </w:pPr>
       <w:r>
-        <w:t xml:space="preserve">Script activate/deactivate</w:t>
+        <w:t xml:space="preserve">Scripts et passage d’arguments</w:t>
       </w:r>
     </w:p>
     <w:p>
@@ -196,7 +277,7 @@
         <w:pStyle w:val="FirstParagraph"/>
       </w:pPr>
       <w:r>
-        <w:t xml:space="preserve">Les scripts</w:t>
+        <w:t xml:space="preserve">Le passage d’arguments en ligne de commande permet de transmettre des paramètres dynamiques à un script lors de son lancement depuis le terminal, notamment via le module standard</w:t>
       </w:r>
       <w:r>
         <w:t xml:space="preserve"> </w:t>
@@ -205,13 +286,13 @@
         <w:rPr>
           <w:rStyle w:val="VerbatimChar"/>
         </w:rPr>
-        <w:t xml:space="preserve">activate</w:t>
-      </w:r>
-      <w:r>
-        <w:t xml:space="preserve"> </w:t>
-      </w:r>
-      <w:r>
-        <w:t xml:space="preserve">et</w:t>
+        <w:t xml:space="preserve">sys</w:t>
+      </w:r>
+      <w:r>
+        <w:t xml:space="preserve"> </w:t>
+      </w:r>
+      <w:r>
+        <w:t xml:space="preserve">ou</w:t>
       </w:r>
       <w:r>
         <w:t xml:space="preserve"> </w:t>
@@ -220,13 +301,101 @@
         <w:rPr>
           <w:rStyle w:val="VerbatimChar"/>
         </w:rPr>
-        <w:t xml:space="preserve">deactivate</w:t>
-      </w:r>
-      <w:r>
-        <w:t xml:space="preserve"> </w:t>
-      </w:r>
-      <w:r>
-        <w:t xml:space="preserve">permettent respectivement d’activer et de quitter l’environnement virtuel pour rediriger dynamiquement l’utilisation de la commande</w:t>
+        <w:t xml:space="preserve">argparse</w:t>
+      </w:r>
+      <w:r>
+        <w:t xml:space="preserve">.</w:t>
+      </w:r>
+    </w:p>
+    <w:p>
+      <w:pPr>
+        <w:pStyle w:val="SourceCode"/>
+      </w:pPr>
+      <w:r>
+        <w:rPr>
+          <w:rStyle w:val="ImportTok"/>
+        </w:rPr>
+        <w:t xml:space="preserve">import</w:t>
+      </w:r>
+      <w:r>
+        <w:rPr>
+          <w:rStyle w:val="NormalTok"/>
+        </w:rPr>
+        <w:t xml:space="preserve"> sys</w:t>
+      </w:r>
+      <w:r>
+        <w:br/>
+      </w:r>
+      <w:r>
+        <w:br/>
+      </w:r>
+      <w:r>
+        <w:rPr>
+          <w:rStyle w:val="CommentTok"/>
+        </w:rPr>
+        <w:t xml:space="preserve"># Récupération des arguments passés en ligne de commande</w:t>
+      </w:r>
+      <w:r>
+        <w:br/>
+      </w:r>
+      <w:r>
+        <w:rPr>
+          <w:rStyle w:val="NormalTok"/>
+        </w:rPr>
+        <w:t xml:space="preserve">arguments </w:t>
+      </w:r>
+      <w:r>
+        <w:rPr>
+          <w:rStyle w:val="OperatorTok"/>
+        </w:rPr>
+        <w:t xml:space="preserve">=</w:t>
+      </w:r>
+      <w:r>
+        <w:rPr>
+          <w:rStyle w:val="NormalTok"/>
+        </w:rPr>
+        <w:t xml:space="preserve"> sys.argv</w:t>
+      </w:r>
+      <w:r>
+        <w:br/>
+      </w:r>
+      <w:r>
+        <w:rPr>
+          <w:rStyle w:val="NormalTok"/>
+        </w:rPr>
+        <w:t xml:space="preserve">nom_script </w:t>
+      </w:r>
+      <w:r>
+        <w:rPr>
+          <w:rStyle w:val="OperatorTok"/>
+        </w:rPr>
+        <w:t xml:space="preserve">=</w:t>
+      </w:r>
+      <w:r>
+        <w:rPr>
+          <w:rStyle w:val="NormalTok"/>
+        </w:rPr>
+        <w:t xml:space="preserve"> sys.argv[</w:t>
+      </w:r>
+      <w:r>
+        <w:rPr>
+          <w:rStyle w:val="DecValTok"/>
+        </w:rPr>
+        <w:t xml:space="preserve">0</w:t>
+      </w:r>
+      <w:r>
+        <w:rPr>
+          <w:rStyle w:val="NormalTok"/>
+        </w:rPr>
+        <w:t xml:space="preserve">]</w:t>
+      </w:r>
+    </w:p>
+    <w:p>
+      <w:pPr>
+        <w:pStyle w:val="BlockText"/>
+      </w:pPr>
+      <w:r>
+        <w:t xml:space="preserve">💡 Privilégiez l’utilisation du module</w:t>
       </w:r>
       <w:r>
         <w:t xml:space="preserve"> </w:t>
@@ -235,59 +404,13 @@
         <w:rPr>
           <w:rStyle w:val="VerbatimChar"/>
         </w:rPr>
-        <w:t xml:space="preserve">pip</w:t>
-      </w:r>
-      <w:r>
-        <w:t xml:space="preserve"> </w:t>
-      </w:r>
-      <w:r>
-        <w:t xml:space="preserve">vers le dossier isolé.</w:t>
-      </w:r>
-    </w:p>
-    <w:p>
-      <w:pPr>
-        <w:pStyle w:val="SourceCode"/>
-      </w:pPr>
-      <w:r>
-        <w:rPr>
-          <w:rStyle w:val="CommentTok"/>
-        </w:rPr>
-        <w:t xml:space="preserve"># Activation de l'environnement virtuel sous Linux / macOS</w:t>
-      </w:r>
-      <w:r>
-        <w:br/>
-      </w:r>
-      <w:r>
-        <w:rPr>
-          <w:rStyle w:val="BuiltInTok"/>
-        </w:rPr>
-        <w:t xml:space="preserve">source</w:t>
-      </w:r>
-      <w:r>
-        <w:rPr>
-          <w:rStyle w:val="NormalTok"/>
-        </w:rPr>
-        <w:t xml:space="preserve"> .venv/bin/activate</w:t>
-      </w:r>
-    </w:p>
-    <w:p>
-      <w:pPr>
-        <w:pStyle w:val="BlockText"/>
-      </w:pPr>
-      <w:r>
-        <w:t xml:space="preserve">💡 Vérifiez toujours que votre invite de commande affiche le nom de l’environnement entre parenthèses (par exemple</w:t>
-      </w:r>
-      <w:r>
-        <w:t xml:space="preserve"> </w:t>
-      </w:r>
-      <w:r>
-        <w:rPr>
-          <w:rStyle w:val="VerbatimChar"/>
-        </w:rPr>
-        <w:t xml:space="preserve">(.venv)</w:t>
-      </w:r>
-      <w:r>
-        <w:t xml:space="preserve">) pour confirmer son activation correcte avant d’installer vos paquets.</w:t>
+        <w:t xml:space="preserve">argparse</w:t>
+      </w:r>
+      <w:r>
+        <w:t xml:space="preserve"> </w:t>
+      </w:r>
+      <w:r>
+        <w:t xml:space="preserve">pour les scripts complexes afin de gérer automatiquement l’aide, les options obligatoires et les types d’arguments.</w:t>
       </w:r>
     </w:p>
     <w:p>
@@ -298,12 +421,110 @@
       </w:r>
     </w:p>
     <w:bookmarkEnd w:id="21"/>
-    <w:bookmarkStart w:id="22" w:name="exemple-de-synthèse"/>
+    <w:bookmarkStart w:id="22" w:name="gestion-de-package---pip"/>
     <w:p>
       <w:pPr>
         <w:pStyle w:val="Heading2"/>
       </w:pPr>
       <w:r>
+        <w:t xml:space="preserve">Gestion de package - pip</w:t>
+      </w:r>
+    </w:p>
+    <w:p>
+      <w:pPr>
+        <w:pStyle w:val="FirstParagraph"/>
+      </w:pPr>
+      <w:r>
+        <w:t xml:space="preserve">L’outil</w:t>
+      </w:r>
+      <w:r>
+        <w:t xml:space="preserve"> </w:t>
+      </w:r>
+      <w:r>
+        <w:rPr>
+          <w:rStyle w:val="VerbatimChar"/>
+        </w:rPr>
+        <w:t xml:space="preserve">pip</w:t>
+      </w:r>
+      <w:r>
+        <w:t xml:space="preserve"> </w:t>
+      </w:r>
+      <w:r>
+        <w:t xml:space="preserve">est le gestionnaire de paquets officiel de Python qui permet d’installer, de mettre à jour et de supprimer des bibliothèques tierces depuis le Python Package Index (PyPI).</w:t>
+      </w:r>
+    </w:p>
+    <w:p>
+      <w:pPr>
+        <w:pStyle w:val="SourceCode"/>
+      </w:pPr>
+      <w:r>
+        <w:rPr>
+          <w:rStyle w:val="CommentTok"/>
+        </w:rPr>
+        <w:t xml:space="preserve"># Installation d'un package tiers en ligne de commande (exemple)</w:t>
+      </w:r>
+      <w:r>
+        <w:br/>
+      </w:r>
+      <w:r>
+        <w:rPr>
+          <w:rStyle w:val="ExtensionTok"/>
+        </w:rPr>
+        <w:t xml:space="preserve">pip</w:t>
+      </w:r>
+      <w:r>
+        <w:rPr>
+          <w:rStyle w:val="NormalTok"/>
+        </w:rPr>
+        <w:t xml:space="preserve"> install requests</w:t>
+      </w:r>
+    </w:p>
+    <w:p>
+      <w:pPr>
+        <w:pStyle w:val="BlockText"/>
+      </w:pPr>
+      <w:r>
+        <w:t xml:space="preserve">💡 Utilisez systématiquement un environnement virtuel (</w:t>
+      </w:r>
+      <w:r>
+        <w:rPr>
+          <w:rStyle w:val="VerbatimChar"/>
+        </w:rPr>
+        <w:t xml:space="preserve">venv</w:t>
+      </w:r>
+      <w:r>
+        <w:t xml:space="preserve">) avant d’installer des packages avec</w:t>
+      </w:r>
+      <w:r>
+        <w:t xml:space="preserve"> </w:t>
+      </w:r>
+      <w:r>
+        <w:rPr>
+          <w:rStyle w:val="VerbatimChar"/>
+        </w:rPr>
+        <w:t xml:space="preserve">pip</w:t>
+      </w:r>
+      <w:r>
+        <w:t xml:space="preserve"> </w:t>
+      </w:r>
+      <w:r>
+        <w:t xml:space="preserve">pour isoler les dépendances de vos différents projets.</w:t>
+      </w:r>
+    </w:p>
+    <w:p>
+      <w:r>
+        <w:pict>
+          <v:rect style="width:0;height:1.5pt" o:hralign="center" o:hrstd="t" o:hr="t"/>
+        </w:pict>
+      </w:r>
+    </w:p>
+    <w:bookmarkEnd w:id="22"/>
+    <w:bookmarkStart w:id="23" w:name="exemple-de-synthèse"/>
+    <w:p>
+      <w:pPr>
+        <w:pStyle w:val="Heading2"/>
+      </w:pPr>
+      <w:r>
         <w:t xml:space="preserve">Exemple de synthèse</w:t>
       </w:r>
     </w:p>
@@ -313,127 +534,535 @@
       </w:pPr>
       <w:r>
         <w:rPr>
+          <w:rStyle w:val="ImportTok"/>
+        </w:rPr>
+        <w:t xml:space="preserve">import</w:t>
+      </w:r>
+      <w:r>
+        <w:rPr>
+          <w:rStyle w:val="NormalTok"/>
+        </w:rPr>
+        <w:t xml:space="preserve"> sys</w:t>
+      </w:r>
+      <w:r>
+        <w:br/>
+      </w:r>
+      <w:r>
+        <w:br/>
+      </w:r>
+      <w:r>
+        <w:rPr>
+          <w:rStyle w:val="KeywordTok"/>
+        </w:rPr>
+        <w:t xml:space="preserve">def</w:t>
+      </w:r>
+      <w:r>
+        <w:rPr>
+          <w:rStyle w:val="NormalTok"/>
+        </w:rPr>
+        <w:t xml:space="preserve"> traiter_commande_cli():</w:t>
+      </w:r>
+      <w:r>
+        <w:br/>
+      </w:r>
+      <w:r>
+        <w:rPr>
+          <w:rStyle w:val="NormalTok"/>
+        </w:rPr>
+        <w:t xml:space="preserve">    </w:t>
+      </w:r>
+      <w:r>
+        <w:rPr>
           <w:rStyle w:val="CommentTok"/>
         </w:rPr>
-        <w:t xml:space="preserve"># Séquence complète de commandes pour configurer et utiliser un environnement virtuel sous Linux/macOS :</w:t>
-      </w:r>
-      <w:r>
-        <w:br/>
-      </w:r>
-      <w:r>
-        <w:br/>
+        <w:t xml:space="preserve">"""Simule un script en ligne de commande avec gestion des arguments."""</w:t>
+      </w:r>
+      <w:r>
+        <w:br/>
+      </w:r>
+      <w:r>
+        <w:rPr>
+          <w:rStyle w:val="NormalTok"/>
+        </w:rPr>
+        <w:t xml:space="preserve">    </w:t>
       </w:r>
       <w:r>
         <w:rPr>
           <w:rStyle w:val="CommentTok"/>
         </w:rPr>
-        <w:t xml:space="preserve"># 1. Création du contexte Python isolé</w:t>
-      </w:r>
-      <w:r>
-        <w:br/>
-      </w:r>
-      <w:r>
-        <w:rPr>
-          <w:rStyle w:val="ExtensionTok"/>
-        </w:rPr>
-        <w:t xml:space="preserve">python</w:t>
-      </w:r>
-      <w:r>
-        <w:rPr>
-          <w:rStyle w:val="NormalTok"/>
-        </w:rPr>
-        <w:t xml:space="preserve"> </w:t>
-      </w:r>
-      <w:r>
-        <w:rPr>
-          <w:rStyle w:val="AttributeTok"/>
-        </w:rPr>
-        <w:t xml:space="preserve">-m</w:t>
-      </w:r>
-      <w:r>
-        <w:rPr>
-          <w:rStyle w:val="NormalTok"/>
-        </w:rPr>
-        <w:t xml:space="preserve"> venv mon_env</w:t>
-      </w:r>
-      <w:r>
-        <w:br/>
-      </w:r>
-      <w:r>
-        <w:br/>
+        <w:t xml:space="preserve"># Vérification du point d'entrée principal</w:t>
+      </w:r>
+      <w:r>
+        <w:br/>
+      </w:r>
+      <w:r>
+        <w:rPr>
+          <w:rStyle w:val="NormalTok"/>
+        </w:rPr>
+        <w:t xml:space="preserve">    </w:t>
+      </w:r>
+      <w:r>
+        <w:rPr>
+          <w:rStyle w:val="ControlFlowTok"/>
+        </w:rPr>
+        <w:t xml:space="preserve">if</w:t>
+      </w:r>
+      <w:r>
+        <w:rPr>
+          <w:rStyle w:val="NormalTok"/>
+        </w:rPr>
+        <w:t xml:space="preserve"> </w:t>
+      </w:r>
+      <w:r>
+        <w:rPr>
+          <w:rStyle w:val="BuiltInTok"/>
+        </w:rPr>
+        <w:t xml:space="preserve">len</w:t>
+      </w:r>
+      <w:r>
+        <w:rPr>
+          <w:rStyle w:val="NormalTok"/>
+        </w:rPr>
+        <w:t xml:space="preserve">(sys.argv) </w:t>
+      </w:r>
+      <w:r>
+        <w:rPr>
+          <w:rStyle w:val="OperatorTok"/>
+        </w:rPr>
+        <w:t xml:space="preserve">&lt;</w:t>
+      </w:r>
+      <w:r>
+        <w:rPr>
+          <w:rStyle w:val="NormalTok"/>
+        </w:rPr>
+        <w:t xml:space="preserve"> </w:t>
+      </w:r>
+      <w:r>
+        <w:rPr>
+          <w:rStyle w:val="DecValTok"/>
+        </w:rPr>
+        <w:t xml:space="preserve">2</w:t>
+      </w:r>
+      <w:r>
+        <w:rPr>
+          <w:rStyle w:val="NormalTok"/>
+        </w:rPr>
+        <w:t xml:space="preserve">:</w:t>
+      </w:r>
+      <w:r>
+        <w:br/>
+      </w:r>
+      <w:r>
+        <w:rPr>
+          <w:rStyle w:val="NormalTok"/>
+        </w:rPr>
+        <w:t xml:space="preserve">        </w:t>
+      </w:r>
+      <w:r>
+        <w:rPr>
+          <w:rStyle w:val="BuiltInTok"/>
+        </w:rPr>
+        <w:t xml:space="preserve">print</w:t>
+      </w:r>
+      <w:r>
+        <w:rPr>
+          <w:rStyle w:val="NormalTok"/>
+        </w:rPr>
+        <w:t xml:space="preserve">(</w:t>
+      </w:r>
+      <w:r>
+        <w:rPr>
+          <w:rStyle w:val="StringTok"/>
+        </w:rPr>
+        <w:t xml:space="preserve">"Erreur : Veuillez fournir un argument (ex: start ou stop)."</w:t>
+      </w:r>
+      <w:r>
+        <w:rPr>
+          <w:rStyle w:val="NormalTok"/>
+        </w:rPr>
+        <w:t xml:space="preserve">)</w:t>
+      </w:r>
+      <w:r>
+        <w:br/>
+      </w:r>
+      <w:r>
+        <w:rPr>
+          <w:rStyle w:val="NormalTok"/>
+        </w:rPr>
+        <w:t xml:space="preserve">        </w:t>
+      </w:r>
+      <w:r>
+        <w:rPr>
+          <w:rStyle w:val="ControlFlowTok"/>
+        </w:rPr>
+        <w:t xml:space="preserve">return</w:t>
+      </w:r>
+      <w:r>
+        <w:br/>
+      </w:r>
+      <w:r>
+        <w:rPr>
+          <w:rStyle w:val="NormalTok"/>
+        </w:rPr>
+        <w:t xml:space="preserve">    </w:t>
+      </w:r>
+      <w:r>
+        <w:br/>
+      </w:r>
+      <w:r>
+        <w:rPr>
+          <w:rStyle w:val="NormalTok"/>
+        </w:rPr>
+        <w:t xml:space="preserve">    action </w:t>
+      </w:r>
+      <w:r>
+        <w:rPr>
+          <w:rStyle w:val="OperatorTok"/>
+        </w:rPr>
+        <w:t xml:space="preserve">=</w:t>
+      </w:r>
+      <w:r>
+        <w:rPr>
+          <w:rStyle w:val="NormalTok"/>
+        </w:rPr>
+        <w:t xml:space="preserve"> sys.argv[</w:t>
+      </w:r>
+      <w:r>
+        <w:rPr>
+          <w:rStyle w:val="DecValTok"/>
+        </w:rPr>
+        <w:t xml:space="preserve">1</w:t>
+      </w:r>
+      <w:r>
+        <w:rPr>
+          <w:rStyle w:val="NormalTok"/>
+        </w:rPr>
+        <w:t xml:space="preserve">].lower()</w:t>
+      </w:r>
+      <w:r>
+        <w:br/>
+      </w:r>
+      <w:r>
+        <w:rPr>
+          <w:rStyle w:val="NormalTok"/>
+        </w:rPr>
+        <w:t xml:space="preserve">    </w:t>
+      </w:r>
+      <w:r>
+        <w:br/>
+      </w:r>
+      <w:r>
+        <w:rPr>
+          <w:rStyle w:val="NormalTok"/>
+        </w:rPr>
+        <w:t xml:space="preserve">    </w:t>
       </w:r>
       <w:r>
         <w:rPr>
           <w:rStyle w:val="CommentTok"/>
         </w:rPr>
-        <w:t xml:space="preserve"># 2. Activation de l'environnement virtuel</w:t>
-      </w:r>
-      <w:r>
-        <w:br/>
+        <w:t xml:space="preserve"># Traitement conditionnel basé sur l'argument reçu</w:t>
+      </w:r>
+      <w:r>
+        <w:br/>
+      </w:r>
+      <w:r>
+        <w:rPr>
+          <w:rStyle w:val="NormalTok"/>
+        </w:rPr>
+        <w:t xml:space="preserve">    </w:t>
+      </w:r>
+      <w:r>
+        <w:rPr>
+          <w:rStyle w:val="ControlFlowTok"/>
+        </w:rPr>
+        <w:t xml:space="preserve">if</w:t>
+      </w:r>
+      <w:r>
+        <w:rPr>
+          <w:rStyle w:val="NormalTok"/>
+        </w:rPr>
+        <w:t xml:space="preserve"> action </w:t>
+      </w:r>
+      <w:r>
+        <w:rPr>
+          <w:rStyle w:val="OperatorTok"/>
+        </w:rPr>
+        <w:t xml:space="preserve">==</w:t>
+      </w:r>
+      <w:r>
+        <w:rPr>
+          <w:rStyle w:val="NormalTok"/>
+        </w:rPr>
+        <w:t xml:space="preserve"> </w:t>
+      </w:r>
+      <w:r>
+        <w:rPr>
+          <w:rStyle w:val="StringTok"/>
+        </w:rPr>
+        <w:t xml:space="preserve">"start"</w:t>
+      </w:r>
+      <w:r>
+        <w:rPr>
+          <w:rStyle w:val="NormalTok"/>
+        </w:rPr>
+        <w:t xml:space="preserve">:</w:t>
+      </w:r>
+      <w:r>
+        <w:br/>
+      </w:r>
+      <w:r>
+        <w:rPr>
+          <w:rStyle w:val="NormalTok"/>
+        </w:rPr>
+        <w:t xml:space="preserve">        </w:t>
       </w:r>
       <w:r>
         <w:rPr>
           <w:rStyle w:val="BuiltInTok"/>
         </w:rPr>
-        <w:t xml:space="preserve">source</w:t>
-      </w:r>
-      <w:r>
-        <w:rPr>
-          <w:rStyle w:val="NormalTok"/>
-        </w:rPr>
-        <w:t xml:space="preserve"> mon_env/bin/activate</w:t>
-      </w:r>
-      <w:r>
-        <w:br/>
-      </w:r>
-      <w:r>
-        <w:br/>
-      </w:r>
-      <w:r>
-        <w:rPr>
-          <w:rStyle w:val="CommentTok"/>
-        </w:rPr>
-        <w:t xml:space="preserve"># 3. Installation d'une bibliothèque tierce dans cet environnement isolé</w:t>
-      </w:r>
-      <w:r>
-        <w:br/>
-      </w:r>
-      <w:r>
-        <w:rPr>
-          <w:rStyle w:val="ExtensionTok"/>
-        </w:rPr>
-        <w:t xml:space="preserve">pip</w:t>
-      </w:r>
-      <w:r>
-        <w:rPr>
-          <w:rStyle w:val="NormalTok"/>
-        </w:rPr>
-        <w:t xml:space="preserve"> install requests</w:t>
-      </w:r>
-      <w:r>
-        <w:br/>
-      </w:r>
-      <w:r>
-        <w:br/>
-      </w:r>
-      <w:r>
-        <w:rPr>
-          <w:rStyle w:val="CommentTok"/>
-        </w:rPr>
-        <w:t xml:space="preserve"># 4. Sortie de l'environnement virtuel</w:t>
-      </w:r>
-      <w:r>
-        <w:br/>
-      </w:r>
-      <w:r>
-        <w:rPr>
-          <w:rStyle w:val="ExtensionTok"/>
-        </w:rPr>
-        <w:t xml:space="preserve">deactivate</w:t>
-      </w:r>
-    </w:p>
-    <w:bookmarkEnd w:id="22"/>
-    <w:bookmarkStart w:id="23" w:name="exercices"/>
+        <w:t xml:space="preserve">print</w:t>
+      </w:r>
+      <w:r>
+        <w:rPr>
+          <w:rStyle w:val="NormalTok"/>
+        </w:rPr>
+        <w:t xml:space="preserve">(</w:t>
+      </w:r>
+      <w:r>
+        <w:rPr>
+          <w:rStyle w:val="StringTok"/>
+        </w:rPr>
+        <w:t xml:space="preserve">"Démarrage du service en ligne de commande..."</w:t>
+      </w:r>
+      <w:r>
+        <w:rPr>
+          <w:rStyle w:val="NormalTok"/>
+        </w:rPr>
+        <w:t xml:space="preserve">)</w:t>
+      </w:r>
+      <w:r>
+        <w:br/>
+      </w:r>
+      <w:r>
+        <w:rPr>
+          <w:rStyle w:val="NormalTok"/>
+        </w:rPr>
+        <w:t xml:space="preserve">    </w:t>
+      </w:r>
+      <w:r>
+        <w:rPr>
+          <w:rStyle w:val="ControlFlowTok"/>
+        </w:rPr>
+        <w:t xml:space="preserve">elif</w:t>
+      </w:r>
+      <w:r>
+        <w:rPr>
+          <w:rStyle w:val="NormalTok"/>
+        </w:rPr>
+        <w:t xml:space="preserve"> action </w:t>
+      </w:r>
+      <w:r>
+        <w:rPr>
+          <w:rStyle w:val="OperatorTok"/>
+        </w:rPr>
+        <w:t xml:space="preserve">==</w:t>
+      </w:r>
+      <w:r>
+        <w:rPr>
+          <w:rStyle w:val="NormalTok"/>
+        </w:rPr>
+        <w:t xml:space="preserve"> </w:t>
+      </w:r>
+      <w:r>
+        <w:rPr>
+          <w:rStyle w:val="StringTok"/>
+        </w:rPr>
+        <w:t xml:space="preserve">"stop"</w:t>
+      </w:r>
+      <w:r>
+        <w:rPr>
+          <w:rStyle w:val="NormalTok"/>
+        </w:rPr>
+        <w:t xml:space="preserve">:</w:t>
+      </w:r>
+      <w:r>
+        <w:br/>
+      </w:r>
+      <w:r>
+        <w:rPr>
+          <w:rStyle w:val="NormalTok"/>
+        </w:rPr>
+        <w:t xml:space="preserve">        </w:t>
+      </w:r>
+      <w:r>
+        <w:rPr>
+          <w:rStyle w:val="BuiltInTok"/>
+        </w:rPr>
+        <w:t xml:space="preserve">print</w:t>
+      </w:r>
+      <w:r>
+        <w:rPr>
+          <w:rStyle w:val="NormalTok"/>
+        </w:rPr>
+        <w:t xml:space="preserve">(</w:t>
+      </w:r>
+      <w:r>
+        <w:rPr>
+          <w:rStyle w:val="StringTok"/>
+        </w:rPr>
+        <w:t xml:space="preserve">"Arrêt du service demandé."</w:t>
+      </w:r>
+      <w:r>
+        <w:rPr>
+          <w:rStyle w:val="NormalTok"/>
+        </w:rPr>
+        <w:t xml:space="preserve">)</w:t>
+      </w:r>
+      <w:r>
+        <w:br/>
+      </w:r>
+      <w:r>
+        <w:rPr>
+          <w:rStyle w:val="NormalTok"/>
+        </w:rPr>
+        <w:t xml:space="preserve">    </w:t>
+      </w:r>
+      <w:r>
+        <w:rPr>
+          <w:rStyle w:val="ControlFlowTok"/>
+        </w:rPr>
+        <w:t xml:space="preserve">else</w:t>
+      </w:r>
+      <w:r>
+        <w:rPr>
+          <w:rStyle w:val="NormalTok"/>
+        </w:rPr>
+        <w:t xml:space="preserve">:</w:t>
+      </w:r>
+      <w:r>
+        <w:br/>
+      </w:r>
+      <w:r>
+        <w:rPr>
+          <w:rStyle w:val="NormalTok"/>
+        </w:rPr>
+        <w:t xml:space="preserve">        </w:t>
+      </w:r>
+      <w:r>
+        <w:rPr>
+          <w:rStyle w:val="BuiltInTok"/>
+        </w:rPr>
+        <w:t xml:space="preserve">print</w:t>
+      </w:r>
+      <w:r>
+        <w:rPr>
+          <w:rStyle w:val="NormalTok"/>
+        </w:rPr>
+        <w:t xml:space="preserve">(</w:t>
+      </w:r>
+      <w:r>
+        <w:rPr>
+          <w:rStyle w:val="SpecialStringTok"/>
+        </w:rPr>
+        <w:t xml:space="preserve">f"Action inconnue : </w:t>
+      </w:r>
+      <w:r>
+        <w:rPr>
+          <w:rStyle w:val="SpecialCharTok"/>
+        </w:rPr>
+        <w:t xml:space="preserve">{</w:t>
+      </w:r>
+      <w:r>
+        <w:rPr>
+          <w:rStyle w:val="NormalTok"/>
+        </w:rPr>
+        <w:t xml:space="preserve">action</w:t>
+      </w:r>
+      <w:r>
+        <w:rPr>
+          <w:rStyle w:val="SpecialCharTok"/>
+        </w:rPr>
+        <w:t xml:space="preserve">}</w:t>
+      </w:r>
+      <w:r>
+        <w:rPr>
+          <w:rStyle w:val="SpecialStringTok"/>
+        </w:rPr>
+        <w:t xml:space="preserve">"</w:t>
+      </w:r>
+      <w:r>
+        <w:rPr>
+          <w:rStyle w:val="NormalTok"/>
+        </w:rPr>
+        <w:t xml:space="preserve">)</w:t>
+      </w:r>
+      <w:r>
+        <w:br/>
+      </w:r>
+      <w:r>
+        <w:br/>
+      </w:r>
+      <w:r>
+        <w:rPr>
+          <w:rStyle w:val="ControlFlowTok"/>
+        </w:rPr>
+        <w:t xml:space="preserve">if</w:t>
+      </w:r>
+      <w:r>
+        <w:rPr>
+          <w:rStyle w:val="NormalTok"/>
+        </w:rPr>
+        <w:t xml:space="preserve"> </w:t>
+      </w:r>
+      <w:r>
+        <w:rPr>
+          <w:rStyle w:val="VariableTok"/>
+        </w:rPr>
+        <w:t xml:space="preserve">__name__</w:t>
+      </w:r>
+      <w:r>
+        <w:rPr>
+          <w:rStyle w:val="NormalTok"/>
+        </w:rPr>
+        <w:t xml:space="preserve"> </w:t>
+      </w:r>
+      <w:r>
+        <w:rPr>
+          <w:rStyle w:val="OperatorTok"/>
+        </w:rPr>
+        <w:t xml:space="preserve">==</w:t>
+      </w:r>
+      <w:r>
+        <w:rPr>
+          <w:rStyle w:val="NormalTok"/>
+        </w:rPr>
+        <w:t xml:space="preserve"> </w:t>
+      </w:r>
+      <w:r>
+        <w:rPr>
+          <w:rStyle w:val="StringTok"/>
+        </w:rPr>
+        <w:t xml:space="preserve">"__main__"</w:t>
+      </w:r>
+      <w:r>
+        <w:rPr>
+          <w:rStyle w:val="NormalTok"/>
+        </w:rPr>
+        <w:t xml:space="preserve">:</w:t>
+      </w:r>
+      <w:r>
+        <w:br/>
+      </w:r>
+      <w:r>
+        <w:rPr>
+          <w:rStyle w:val="NormalTok"/>
+        </w:rPr>
+        <w:t xml:space="preserve">    traiter_commande_cli()</w:t>
+      </w:r>
+    </w:p>
+    <w:bookmarkEnd w:id="23"/>
+    <w:bookmarkStart w:id="24" w:name="exercices"/>
     <w:p>
       <w:pPr>
         <w:pStyle w:val="Heading2"/>
@@ -461,7 +1090,7 @@
         <w:t xml:space="preserve"> </w:t>
       </w:r>
       <w:r>
-        <w:t xml:space="preserve">Exécutez la commande dans votre terminal pour créer un environnement virtuel nommé</w:t>
+        <w:t xml:space="preserve">Écrivez un script Python comportant une structure</w:t>
       </w:r>
       <w:r>
         <w:t xml:space="preserve"> </w:t>
@@ -470,13 +1099,13 @@
         <w:rPr>
           <w:rStyle w:val="VerbatimChar"/>
         </w:rPr>
-        <w:t xml:space="preserve">env_projet</w:t>
-      </w:r>
-      <w:r>
-        <w:t xml:space="preserve"> </w:t>
-      </w:r>
-      <w:r>
-        <w:t xml:space="preserve">à la racine de votre dossier de travail.</w:t>
+        <w:t xml:space="preserve">if __name__ == "__main__":</w:t>
+      </w:r>
+      <w:r>
+        <w:t xml:space="preserve"> </w:t>
+      </w:r>
+      <w:r>
+        <w:t xml:space="preserve">qui affiche un message de bienvenue personnalisé lorsque le fichier est exécuté directement.</w:t>
       </w:r>
     </w:p>
     <w:p>
@@ -498,11 +1127,26 @@
         <w:t xml:space="preserve"> </w:t>
       </w:r>
       <w:r>
-        <w:t xml:space="preserve">Activez l’environnement virtuel créé, vérifiez son bon fonctionnement, puis désactivez-le à l’aide de la commande appropriée.</w:t>
-      </w:r>
-    </w:p>
-    <w:bookmarkEnd w:id="23"/>
+        <w:t xml:space="preserve">Utilisez le module</w:t>
+      </w:r>
+      <w:r>
+        <w:t xml:space="preserve"> </w:t>
+      </w:r>
+      <w:r>
+        <w:rPr>
+          <w:rStyle w:val="VerbatimChar"/>
+        </w:rPr>
+        <w:t xml:space="preserve">sys</w:t>
+      </w:r>
+      <w:r>
+        <w:t xml:space="preserve"> </w:t>
+      </w:r>
+      <w:r>
+        <w:t xml:space="preserve">pour récupérer un nom passé en argument dans le terminal et affichez une salutation personnalisée intégrant ce paramètre.</w:t>
+      </w:r>
+    </w:p>
     <w:bookmarkEnd w:id="24"/>
+    <w:bookmarkEnd w:id="25"/>
     <w:sectPr/>
   </w:body>
 </w:document>

</xml_diff>